<commit_message>
Fix demo file references in README and guide
</commit_message>
<xml_diff>
--- a/report/GUIDE.docx
+++ b/report/GUIDE.docx
@@ -411,7 +411,7 @@
         <w:pStyle w:val="Heading2"/>
       </w:pPr>
       <w:r>
-        <w:t>4. How to open and use the interactive demo (showcase/demo.html)</w:t>
+        <w:t>4. How to open and use the interactive demo (index.html)</w:t>
       </w:r>
     </w:p>
     <w:p>
@@ -427,7 +427,7 @@
           <w:color w:val="8A1F5C"/>
           <w:sz w:val="19"/>
         </w:rPr>
-        <w:t>showcase/demo.html</w:t>
+        <w:t>index.html</w:t>
       </w:r>
       <w:r>
         <w:t xml:space="preserve"> (or right-click → Open with → Chrome/Edge). Use a wide window. Do </w:t>

</xml_diff>

<commit_message>
Add Learning tab: training curves, stability and exploration views from the real training logs
</commit_message>
<xml_diff>
--- a/report/GUIDE.docx
+++ b/report/GUIDE.docx
@@ -415,11 +415,8 @@
       </w:r>
     </w:p>
     <w:p>
-      <w:pPr>
-        <w:pStyle w:val="ListNumber"/>
-      </w:pPr>
-      <w:r>
-        <w:t xml:space="preserve">Double-click </w:t>
+      <w:r>
+        <w:t xml:space="preserve">Online: https://dharunprasath720-cmd.github.io/Autonomous-Cyber-Defense-multi-agent-RL/ . Offline: double-click </w:t>
       </w:r>
       <w:r>
         <w:rPr>
@@ -430,27 +427,7 @@
         <w:t>index.html</w:t>
       </w:r>
       <w:r>
-        <w:t xml:space="preserve"> (or right-click → Open with → Chrome/Edge). Use a wide window. Do </w:t>
-      </w:r>
-      <w:r>
-        <w:rPr>
-          <w:b/>
-        </w:rPr>
-        <w:t>not</w:t>
-      </w:r>
-      <w:r>
-        <w:t xml:space="preserve"> open </w:t>
-      </w:r>
-      <w:r>
-        <w:rPr>
-          <w:rFonts w:ascii="Consolas" w:hAnsi="Consolas"/>
-          <w:color w:val="8A1F5C"/>
-          <w:sz w:val="19"/>
-        </w:rPr>
-        <w:t>template.html</w:t>
-      </w:r>
-      <w:r>
-        <w:t>: it is the empty template and shows blank dropdowns.</w:t>
+        <w:t xml:space="preserve"> (use a wide window; it fits one screen on a laptop, nothing to scroll).</w:t>
       </w:r>
     </w:p>
     <w:p>
@@ -458,7 +435,68 @@
         <w:pStyle w:val="ListNumber"/>
       </w:pPr>
       <w:r>
+        <w:rPr>
+          <w:b/>
+        </w:rPr>
         <w:t>Top bar:</w:t>
+      </w:r>
+      <w:r>
+        <w:t xml:space="preserve"> pick the </w:t>
+      </w:r>
+      <w:r>
+        <w:rPr>
+          <w:b/>
+        </w:rPr>
+        <w:t>Defender</w:t>
+      </w:r>
+      <w:r>
+        <w:t xml:space="preserve"> (No defense / Rule-based heuristic / PPO / MAPPO) and an </w:t>
+      </w:r>
+      <w:r>
+        <w:rPr>
+          <w:b/>
+        </w:rPr>
+        <w:t>Episode</w:t>
+      </w:r>
+      <w:r>
+        <w:t xml:space="preserve">; </w:t>
+      </w:r>
+      <w:r>
+        <w:rPr>
+          <w:b/>
+        </w:rPr>
+        <w:t>Speed</w:t>
+      </w:r>
+      <w:r>
+        <w:t xml:space="preserve"> (Normal = 2.6 s per step); ▶ Play, ◀ ▶ to step, and a slider. Keys: space = play, ← → = step, 1-7 = switch tab.</w:t>
+      </w:r>
+    </w:p>
+    <w:p>
+      <w:pPr>
+        <w:pStyle w:val="ListNumber"/>
+      </w:pPr>
+      <w:r>
+        <w:rPr>
+          <w:b/>
+        </w:rPr>
+        <w:t>Left half, the simulation (fixed size):</w:t>
+      </w:r>
+      <w:r>
+        <w:t xml:space="preserve"> three zones (DMZ, Internal, Data tier) with hosts H0-H7. Colour = the host's true state (green clean, yellow early intrusion, orange escalated, red breached). Dashed ring = isolated, ✓ = patched, ◆ = decoy, the thin bar = the anomaly score the defender actually sees. Lines from RED = attack attempts; lines from BLUE = defensive actions.</w:t>
+      </w:r>
+    </w:p>
+    <w:p>
+      <w:pPr>
+        <w:pStyle w:val="ListNumber"/>
+      </w:pPr>
+      <w:r>
+        <w:rPr>
+          <w:b/>
+        </w:rPr>
+        <w:t>Right half, seven tabs</w:t>
+      </w:r>
+      <w:r>
+        <w:t xml:space="preserve"> (a small strip shows this step's reward r, the running score G and breached hosts):</w:t>
       </w:r>
     </w:p>
     <w:p>
@@ -470,10 +508,10 @@
         <w:rPr>
           <w:b/>
         </w:rPr>
-        <w:t>Blue (defender):</w:t>
-      </w:r>
-      <w:r>
-        <w:t xml:space="preserve"> No defense / Rule-based heuristic / PPO / MAPPO.</w:t>
+        <w:t>1 Rewards:</w:t>
+      </w:r>
+      <w:r>
+        <w:t xml:space="preserve"> every reward rule that fired this step, grouped under the action that earned it, with the running score update (before + this step = after) and a per-rule breakdown.</w:t>
       </w:r>
     </w:p>
     <w:p>
@@ -485,10 +523,10 @@
         <w:rPr>
           <w:b/>
         </w:rPr>
-        <w:t>Episode seed:</w:t>
-      </w:r>
-      <w:r>
-        <w:t xml:space="preserve"> two different pre-recorded games.</w:t>
+        <w:t>2 Attack odds:</w:t>
+      </w:r>
+      <w:r>
+        <w:t xml:space="preserve"> the probability calculation for each attack attempt and escalation roll: base chance x vulnerability x zone pressure x defences = P, then the random draw u (0 to 1) compared with P.</w:t>
       </w:r>
     </w:p>
     <w:p>
@@ -500,10 +538,70 @@
         <w:rPr>
           <w:b/>
         </w:rPr>
-        <w:t>▶ Play / ◀ ▶ / slider / Speed:</w:t>
-      </w:r>
-      <w:r>
-        <w:t xml:space="preserve"> replay controls (Normal = 1.8 s per step; Slow = 3 s).</w:t>
+        <w:t>3 Actions:</w:t>
+      </w:r>
+      <w:r>
+        <w:t xml:space="preserve"> the red and blue events of the latest three steps.</w:t>
+      </w:r>
+    </w:p>
+    <w:p>
+      <w:pPr>
+        <w:pStyle w:val="ListBullet"/>
+        <w:ind w:left="792"/>
+      </w:pPr>
+      <w:r>
+        <w:rPr>
+          <w:b/>
+        </w:rPr>
+        <w:t>4 Timeline:</w:t>
+      </w:r>
+      <w:r>
+        <w:t xml:space="preserve"> cumulative reward over the episode; click an event to jump to it.</w:t>
+      </w:r>
+    </w:p>
+    <w:p>
+      <w:pPr>
+        <w:pStyle w:val="ListBullet"/>
+        <w:ind w:left="792"/>
+      </w:pPr>
+      <w:r>
+        <w:rPr>
+          <w:b/>
+        </w:rPr>
+        <w:t>5 Learning:</w:t>
+      </w:r>
+      <w:r>
+        <w:t xml:space="preserve"> how each method improved during training, from the real training logs: return over time, stability (raw vs normalized rewards) and exploration (policy entropy), with headline metrics and a training-step cursor.</w:t>
+      </w:r>
+    </w:p>
+    <w:p>
+      <w:pPr>
+        <w:pStyle w:val="ListBullet"/>
+        <w:ind w:left="792"/>
+      </w:pPr>
+      <w:r>
+        <w:rPr>
+          <w:b/>
+        </w:rPr>
+        <w:t>6 Compare:</w:t>
+      </w:r>
+      <w:r>
+        <w:t xml:space="preserve"> the same episode under every defender.</w:t>
+      </w:r>
+    </w:p>
+    <w:p>
+      <w:pPr>
+        <w:pStyle w:val="ListBullet"/>
+        <w:ind w:left="792"/>
+      </w:pPr>
+      <w:r>
+        <w:rPr>
+          <w:b/>
+        </w:rPr>
+        <w:t>7 Guide:</w:t>
+      </w:r>
+      <w:r>
+        <w:t xml:space="preserve"> how the attacks and defences work.</w:t>
       </w:r>
     </w:p>
     <w:p>
@@ -514,88 +612,10 @@
         <w:rPr>
           <w:b/>
         </w:rPr>
-        <w:t>Left, the network:</w:t>
-      </w:r>
-      <w:r>
-        <w:t xml:space="preserve"> three zone boxes (DMZ, Internal, Data tier). Each circle is a host; its </w:t>
-      </w:r>
-      <w:r>
-        <w:rPr>
-          <w:b/>
-        </w:rPr>
-        <w:t>colour is the true state</w:t>
-      </w:r>
-      <w:r>
-        <w:t xml:space="preserve"> (green clean → yellow early intrusion → orange escalated → red breached). Dashed blue ring = isolated; ✓ = patched; ◆ = honeypot decoy; ⛔ = IP blocked; ⇄ = traffic redirected. The thin bar beside a host is the </w:t>
-      </w:r>
-      <w:r>
-        <w:rPr>
-          <w:b/>
-        </w:rPr>
-        <w:t>anomaly score Blue actually sees</w:t>
-      </w:r>
-      <w:r>
-        <w:t xml:space="preserve"> (it does not see the colour!). Lines: from RED (to a host) = an attack attempt (thick red = landed, dashed = failed/wasted, blue = trapped by a decoy); from BLUE = a defensive action.</w:t>
-      </w:r>
-    </w:p>
-    <w:p>
-      <w:pPr>
-        <w:pStyle w:val="ListNumber"/>
-      </w:pPr>
-      <w:r>
-        <w:rPr>
-          <w:b/>
-        </w:rPr>
-        <w:t>Right, two cards:</w:t>
-      </w:r>
-      <w:r>
-        <w:t xml:space="preserve"> RED's attempts and BLUE's actions this step, each with a written explanation (what happened, the odds, what the defender could and could not see, and the reward effect). </w:t>
-      </w:r>
-      <w:r>
-        <w:rPr>
-          <w:b/>
-        </w:rPr>
-        <w:t>Reward ledger (two cards side by side, under the map):</w:t>
-      </w:r>
-      <w:r>
-        <w:t xml:space="preserve"> left = every reward rule that fired this step with its host, calculation and amount, summing to the step reward r_t (plus a by-zone split); right = the update G_after = G_before + r_t, and the running total per rule (detections, preventions, action costs, downtime, breach penalties).</w:t>
-      </w:r>
-    </w:p>
-    <w:p>
-      <w:pPr>
-        <w:pStyle w:val="ListNumber"/>
-      </w:pPr>
-      <w:r>
-        <w:rPr>
-          <w:b/>
-        </w:rPr>
-        <w:t>Bottom left:</w:t>
-      </w:r>
-      <w:r>
-        <w:t xml:space="preserve"> reward timeline + clickable event log (click a line to jump there). </w:t>
-      </w:r>
-      <w:r>
-        <w:rPr>
-          <w:b/>
-        </w:rPr>
-        <w:t>Bottom right:</w:t>
-      </w:r>
-      <w:r>
-        <w:t xml:space="preserve"> all four defenders on the same episode side by side, plus the 50-episode numbers against the adaptive attacker.</w:t>
-      </w:r>
-    </w:p>
-    <w:p>
-      <w:pPr>
-        <w:pStyle w:val="ListNumber"/>
-      </w:pPr>
-      <w:r>
-        <w:rPr>
-          <w:b/>
-        </w:rPr>
         <w:t>Good things to try:</w:t>
       </w:r>
       <w:r>
-        <w:t xml:space="preserve"> (a) "No defense" with either attacker, to see how quickly everything is breached; (b) watch the ledger as MAPPO or PPO restores a host (+100 +50 −50 −1) and as 'No defense' accumulates −500 per breached host; (c) the heuristic vs PPO, noting how the heuristic isolates then restores while PPO often restores straight away.</w:t>
+        <w:t xml:space="preserve"> watch "No defense" accumulate -500 per breached host; watch MAPPO restore a host (+50 +100 -1 -50 = +99); open Attack odds and check a roll by hand; open Learning and move the cursor to see when each method overtakes the heuristic.</w:t>
       </w:r>
     </w:p>
     <w:p>

</xml_diff>